<commit_message>
update image and docs
</commit_message>
<xml_diff>
--- a/HaChiThanh_23702221_Tuan2.docx
+++ b/HaChiThanh_23702221_Tuan2.docx
@@ -347,7 +347,7 @@
       <w:r>
         <w:drawing>
           <wp:inline xmlns:a="http://schemas.openxmlformats.org/drawingml/2006/main" xmlns:pic="http://schemas.openxmlformats.org/drawingml/2006/picture">
-            <wp:extent cx="5669280" cy="1540565"/>
+            <wp:extent cx="5852160" cy="1285875"/>
             <wp:docPr id="1" name="Picture 1"/>
             <wp:cNvGraphicFramePr>
               <a:graphicFrameLocks noChangeAspect="1"/>
@@ -368,7 +368,7 @@
                   <pic:spPr>
                     <a:xfrm>
                       <a:off x="0" y="0"/>
-                      <a:ext cx="5669280" cy="1540565"/>
+                      <a:ext cx="5852160" cy="1285875"/>
                     </a:xfrm>
                     <a:prstGeom prst="rect"/>
                   </pic:spPr>
@@ -603,7 +603,7 @@
       <w:r>
         <w:drawing>
           <wp:inline xmlns:a="http://schemas.openxmlformats.org/drawingml/2006/main" xmlns:pic="http://schemas.openxmlformats.org/drawingml/2006/picture">
-            <wp:extent cx="5669280" cy="1540565"/>
+            <wp:extent cx="5852160" cy="1285875"/>
             <wp:docPr id="2" name="Picture 2"/>
             <wp:cNvGraphicFramePr>
               <a:graphicFrameLocks noChangeAspect="1"/>
@@ -624,7 +624,7 @@
                   <pic:spPr>
                     <a:xfrm>
                       <a:off x="0" y="0"/>
-                      <a:ext cx="5669280" cy="1540565"/>
+                      <a:ext cx="5852160" cy="1285875"/>
                     </a:xfrm>
                     <a:prstGeom prst="rect"/>
                   </pic:spPr>
@@ -859,7 +859,7 @@
       <w:r>
         <w:drawing>
           <wp:inline xmlns:a="http://schemas.openxmlformats.org/drawingml/2006/main" xmlns:pic="http://schemas.openxmlformats.org/drawingml/2006/picture">
-            <wp:extent cx="5669280" cy="1540565"/>
+            <wp:extent cx="5852160" cy="1285875"/>
             <wp:docPr id="3" name="Picture 3"/>
             <wp:cNvGraphicFramePr>
               <a:graphicFrameLocks noChangeAspect="1"/>
@@ -880,7 +880,7 @@
                   <pic:spPr>
                     <a:xfrm>
                       <a:off x="0" y="0"/>
-                      <a:ext cx="5669280" cy="1540565"/>
+                      <a:ext cx="5852160" cy="1285875"/>
                     </a:xfrm>
                     <a:prstGeom prst="rect"/>
                   </pic:spPr>
@@ -1127,7 +1127,7 @@
       <w:r>
         <w:drawing>
           <wp:inline xmlns:a="http://schemas.openxmlformats.org/drawingml/2006/main" xmlns:pic="http://schemas.openxmlformats.org/drawingml/2006/picture">
-            <wp:extent cx="5669280" cy="1540565"/>
+            <wp:extent cx="5852160" cy="1285875"/>
             <wp:docPr id="4" name="Picture 4"/>
             <wp:cNvGraphicFramePr>
               <a:graphicFrameLocks noChangeAspect="1"/>
@@ -1148,7 +1148,7 @@
                   <pic:spPr>
                     <a:xfrm>
                       <a:off x="0" y="0"/>
-                      <a:ext cx="5669280" cy="1540565"/>
+                      <a:ext cx="5852160" cy="1285875"/>
                     </a:xfrm>
                     <a:prstGeom prst="rect"/>
                   </pic:spPr>
@@ -1383,7 +1383,7 @@
       <w:r>
         <w:drawing>
           <wp:inline xmlns:a="http://schemas.openxmlformats.org/drawingml/2006/main" xmlns:pic="http://schemas.openxmlformats.org/drawingml/2006/picture">
-            <wp:extent cx="5669280" cy="1540565"/>
+            <wp:extent cx="5852160" cy="1285875"/>
             <wp:docPr id="5" name="Picture 5"/>
             <wp:cNvGraphicFramePr>
               <a:graphicFrameLocks noChangeAspect="1"/>
@@ -1404,7 +1404,7 @@
                   <pic:spPr>
                     <a:xfrm>
                       <a:off x="0" y="0"/>
-                      <a:ext cx="5669280" cy="1540565"/>
+                      <a:ext cx="5852160" cy="1285875"/>
                     </a:xfrm>
                     <a:prstGeom prst="rect"/>
                   </pic:spPr>
@@ -1637,7 +1637,7 @@
       <w:r>
         <w:drawing>
           <wp:inline xmlns:a="http://schemas.openxmlformats.org/drawingml/2006/main" xmlns:pic="http://schemas.openxmlformats.org/drawingml/2006/picture">
-            <wp:extent cx="5669280" cy="2002735"/>
+            <wp:extent cx="5852160" cy="1611630"/>
             <wp:docPr id="6" name="Picture 6"/>
             <wp:cNvGraphicFramePr>
               <a:graphicFrameLocks noChangeAspect="1"/>
@@ -1658,7 +1658,7 @@
                   <pic:spPr>
                     <a:xfrm>
                       <a:off x="0" y="0"/>
-                      <a:ext cx="5669280" cy="2002735"/>
+                      <a:ext cx="5852160" cy="1611630"/>
                     </a:xfrm>
                     <a:prstGeom prst="rect"/>
                   </pic:spPr>
@@ -1901,7 +1901,7 @@
       <w:r>
         <w:drawing>
           <wp:inline xmlns:a="http://schemas.openxmlformats.org/drawingml/2006/main" xmlns:pic="http://schemas.openxmlformats.org/drawingml/2006/picture">
-            <wp:extent cx="5669280" cy="1540565"/>
+            <wp:extent cx="5852160" cy="1285875"/>
             <wp:docPr id="7" name="Picture 7"/>
             <wp:cNvGraphicFramePr>
               <a:graphicFrameLocks noChangeAspect="1"/>
@@ -1922,7 +1922,7 @@
                   <pic:spPr>
                     <a:xfrm>
                       <a:off x="0" y="0"/>
-                      <a:ext cx="5669280" cy="1540565"/>
+                      <a:ext cx="5852160" cy="1285875"/>
                     </a:xfrm>
                     <a:prstGeom prst="rect"/>
                   </pic:spPr>
@@ -2179,7 +2179,7 @@
       <w:r>
         <w:drawing>
           <wp:inline xmlns:a="http://schemas.openxmlformats.org/drawingml/2006/main" xmlns:pic="http://schemas.openxmlformats.org/drawingml/2006/picture">
-            <wp:extent cx="5669280" cy="2002735"/>
+            <wp:extent cx="5852160" cy="1611630"/>
             <wp:docPr id="8" name="Picture 8"/>
             <wp:cNvGraphicFramePr>
               <a:graphicFrameLocks noChangeAspect="1"/>
@@ -2200,7 +2200,7 @@
                   <pic:spPr>
                     <a:xfrm>
                       <a:off x="0" y="0"/>
-                      <a:ext cx="5669280" cy="2002735"/>
+                      <a:ext cx="5852160" cy="1611630"/>
                     </a:xfrm>
                     <a:prstGeom prst="rect"/>
                   </pic:spPr>
@@ -2441,7 +2441,7 @@
       <w:r>
         <w:drawing>
           <wp:inline xmlns:a="http://schemas.openxmlformats.org/drawingml/2006/main" xmlns:pic="http://schemas.openxmlformats.org/drawingml/2006/picture">
-            <wp:extent cx="5669280" cy="1694622"/>
+            <wp:extent cx="5852160" cy="1394460"/>
             <wp:docPr id="9" name="Picture 9"/>
             <wp:cNvGraphicFramePr>
               <a:graphicFrameLocks noChangeAspect="1"/>
@@ -2462,7 +2462,7 @@
                   <pic:spPr>
                     <a:xfrm>
                       <a:off x="0" y="0"/>
-                      <a:ext cx="5669280" cy="1694622"/>
+                      <a:ext cx="5852160" cy="1394460"/>
                     </a:xfrm>
                     <a:prstGeom prst="rect"/>
                   </pic:spPr>
@@ -2717,7 +2717,7 @@
       <w:r>
         <w:drawing>
           <wp:inline xmlns:a="http://schemas.openxmlformats.org/drawingml/2006/main" xmlns:pic="http://schemas.openxmlformats.org/drawingml/2006/picture">
-            <wp:extent cx="5669280" cy="1694622"/>
+            <wp:extent cx="5852160" cy="1394460"/>
             <wp:docPr id="10" name="Picture 10"/>
             <wp:cNvGraphicFramePr>
               <a:graphicFrameLocks noChangeAspect="1"/>
@@ -2738,7 +2738,7 @@
                   <pic:spPr>
                     <a:xfrm>
                       <a:off x="0" y="0"/>
-                      <a:ext cx="5669280" cy="1694622"/>
+                      <a:ext cx="5852160" cy="1394460"/>
                     </a:xfrm>
                     <a:prstGeom prst="rect"/>
                   </pic:spPr>
@@ -2970,7 +2970,7 @@
       <w:r>
         <w:drawing>
           <wp:inline xmlns:a="http://schemas.openxmlformats.org/drawingml/2006/main" xmlns:pic="http://schemas.openxmlformats.org/drawingml/2006/picture">
-            <wp:extent cx="5669280" cy="1540565"/>
+            <wp:extent cx="5852160" cy="1285875"/>
             <wp:docPr id="11" name="Picture 11"/>
             <wp:cNvGraphicFramePr>
               <a:graphicFrameLocks noChangeAspect="1"/>
@@ -2991,7 +2991,7 @@
                   <pic:spPr>
                     <a:xfrm>
                       <a:off x="0" y="0"/>
-                      <a:ext cx="5669280" cy="1540565"/>
+                      <a:ext cx="5852160" cy="1285875"/>
                     </a:xfrm>
                     <a:prstGeom prst="rect"/>
                   </pic:spPr>
@@ -3204,7 +3204,7 @@
       <w:r>
         <w:drawing>
           <wp:inline xmlns:a="http://schemas.openxmlformats.org/drawingml/2006/main" xmlns:pic="http://schemas.openxmlformats.org/drawingml/2006/picture">
-            <wp:extent cx="5669280" cy="1694622"/>
+            <wp:extent cx="5852160" cy="1394460"/>
             <wp:docPr id="12" name="Picture 12"/>
             <wp:cNvGraphicFramePr>
               <a:graphicFrameLocks noChangeAspect="1"/>
@@ -3225,7 +3225,7 @@
                   <pic:spPr>
                     <a:xfrm>
                       <a:off x="0" y="0"/>
-                      <a:ext cx="5669280" cy="1694622"/>
+                      <a:ext cx="5852160" cy="1394460"/>
                     </a:xfrm>
                     <a:prstGeom prst="rect"/>
                   </pic:spPr>
@@ -3447,7 +3447,7 @@
       <w:r>
         <w:drawing>
           <wp:inline xmlns:a="http://schemas.openxmlformats.org/drawingml/2006/main" xmlns:pic="http://schemas.openxmlformats.org/drawingml/2006/picture">
-            <wp:extent cx="5669280" cy="1694622"/>
+            <wp:extent cx="5852160" cy="1394460"/>
             <wp:docPr id="13" name="Picture 13"/>
             <wp:cNvGraphicFramePr>
               <a:graphicFrameLocks noChangeAspect="1"/>
@@ -3468,7 +3468,7 @@
                   <pic:spPr>
                     <a:xfrm>
                       <a:off x="0" y="0"/>
-                      <a:ext cx="5669280" cy="1694622"/>
+                      <a:ext cx="5852160" cy="1394460"/>
                     </a:xfrm>
                     <a:prstGeom prst="rect"/>
                   </pic:spPr>
@@ -3683,7 +3683,7 @@
       <w:r>
         <w:drawing>
           <wp:inline xmlns:a="http://schemas.openxmlformats.org/drawingml/2006/main" xmlns:pic="http://schemas.openxmlformats.org/drawingml/2006/picture">
-            <wp:extent cx="5669280" cy="1540565"/>
+            <wp:extent cx="5852160" cy="1285875"/>
             <wp:docPr id="14" name="Picture 14"/>
             <wp:cNvGraphicFramePr>
               <a:graphicFrameLocks noChangeAspect="1"/>
@@ -3704,7 +3704,7 @@
                   <pic:spPr>
                     <a:xfrm>
                       <a:off x="0" y="0"/>
-                      <a:ext cx="5669280" cy="1540565"/>
+                      <a:ext cx="5852160" cy="1285875"/>
                     </a:xfrm>
                     <a:prstGeom prst="rect"/>
                   </pic:spPr>
@@ -3942,7 +3942,7 @@
       <w:r>
         <w:drawing>
           <wp:inline xmlns:a="http://schemas.openxmlformats.org/drawingml/2006/main" xmlns:pic="http://schemas.openxmlformats.org/drawingml/2006/picture">
-            <wp:extent cx="5669280" cy="2156791"/>
+            <wp:extent cx="5852160" cy="1720215"/>
             <wp:docPr id="15" name="Picture 15"/>
             <wp:cNvGraphicFramePr>
               <a:graphicFrameLocks noChangeAspect="1"/>
@@ -3963,7 +3963,7 @@
                   <pic:spPr>
                     <a:xfrm>
                       <a:off x="0" y="0"/>
-                      <a:ext cx="5669280" cy="2156791"/>
+                      <a:ext cx="5852160" cy="1720215"/>
                     </a:xfrm>
                     <a:prstGeom prst="rect"/>
                   </pic:spPr>
@@ -4189,7 +4189,7 @@
       <w:r>
         <w:drawing>
           <wp:inline xmlns:a="http://schemas.openxmlformats.org/drawingml/2006/main" xmlns:pic="http://schemas.openxmlformats.org/drawingml/2006/picture">
-            <wp:extent cx="5669280" cy="2156791"/>
+            <wp:extent cx="5852160" cy="1720215"/>
             <wp:docPr id="16" name="Picture 16"/>
             <wp:cNvGraphicFramePr>
               <a:graphicFrameLocks noChangeAspect="1"/>
@@ -4210,7 +4210,7 @@
                   <pic:spPr>
                     <a:xfrm>
                       <a:off x="0" y="0"/>
-                      <a:ext cx="5669280" cy="2156791"/>
+                      <a:ext cx="5852160" cy="1720215"/>
                     </a:xfrm>
                     <a:prstGeom prst="rect"/>
                   </pic:spPr>
@@ -4431,7 +4431,7 @@
       <w:r>
         <w:drawing>
           <wp:inline xmlns:a="http://schemas.openxmlformats.org/drawingml/2006/main" xmlns:pic="http://schemas.openxmlformats.org/drawingml/2006/picture">
-            <wp:extent cx="5669280" cy="2002735"/>
+            <wp:extent cx="5852160" cy="1611630"/>
             <wp:docPr id="17" name="Picture 17"/>
             <wp:cNvGraphicFramePr>
               <a:graphicFrameLocks noChangeAspect="1"/>
@@ -4452,7 +4452,7 @@
                   <pic:spPr>
                     <a:xfrm>
                       <a:off x="0" y="0"/>
-                      <a:ext cx="5669280" cy="2002735"/>
+                      <a:ext cx="5852160" cy="1611630"/>
                     </a:xfrm>
                     <a:prstGeom prst="rect"/>
                   </pic:spPr>
@@ -4677,7 +4677,7 @@
       <w:r>
         <w:drawing>
           <wp:inline xmlns:a="http://schemas.openxmlformats.org/drawingml/2006/main" xmlns:pic="http://schemas.openxmlformats.org/drawingml/2006/picture">
-            <wp:extent cx="5669280" cy="1540565"/>
+            <wp:extent cx="5852160" cy="1285875"/>
             <wp:docPr id="18" name="Picture 18"/>
             <wp:cNvGraphicFramePr>
               <a:graphicFrameLocks noChangeAspect="1"/>
@@ -4698,7 +4698,7 @@
                   <pic:spPr>
                     <a:xfrm>
                       <a:off x="0" y="0"/>
-                      <a:ext cx="5669280" cy="1540565"/>
+                      <a:ext cx="5852160" cy="1285875"/>
                     </a:xfrm>
                     <a:prstGeom prst="rect"/>
                   </pic:spPr>
@@ -4915,7 +4915,7 @@
       <w:r>
         <w:drawing>
           <wp:inline xmlns:a="http://schemas.openxmlformats.org/drawingml/2006/main" xmlns:pic="http://schemas.openxmlformats.org/drawingml/2006/picture">
-            <wp:extent cx="5669280" cy="2156791"/>
+            <wp:extent cx="5852160" cy="1720215"/>
             <wp:docPr id="19" name="Picture 19"/>
             <wp:cNvGraphicFramePr>
               <a:graphicFrameLocks noChangeAspect="1"/>
@@ -4936,7 +4936,7 @@
                   <pic:spPr>
                     <a:xfrm>
                       <a:off x="0" y="0"/>
-                      <a:ext cx="5669280" cy="2156791"/>
+                      <a:ext cx="5852160" cy="1720215"/>
                     </a:xfrm>
                     <a:prstGeom prst="rect"/>
                   </pic:spPr>
@@ -5174,7 +5174,7 @@
       <w:r>
         <w:drawing>
           <wp:inline xmlns:a="http://schemas.openxmlformats.org/drawingml/2006/main" xmlns:pic="http://schemas.openxmlformats.org/drawingml/2006/picture">
-            <wp:extent cx="5669280" cy="2002735"/>
+            <wp:extent cx="5852160" cy="1611630"/>
             <wp:docPr id="20" name="Picture 20"/>
             <wp:cNvGraphicFramePr>
               <a:graphicFrameLocks noChangeAspect="1"/>
@@ -5195,7 +5195,7 @@
                   <pic:spPr>
                     <a:xfrm>
                       <a:off x="0" y="0"/>
-                      <a:ext cx="5669280" cy="2002735"/>
+                      <a:ext cx="5852160" cy="1611630"/>
                     </a:xfrm>
                     <a:prstGeom prst="rect"/>
                   </pic:spPr>
@@ -5423,7 +5423,7 @@
       <w:r>
         <w:drawing>
           <wp:inline xmlns:a="http://schemas.openxmlformats.org/drawingml/2006/main" xmlns:pic="http://schemas.openxmlformats.org/drawingml/2006/picture">
-            <wp:extent cx="5669280" cy="2156791"/>
+            <wp:extent cx="5852160" cy="1720215"/>
             <wp:docPr id="21" name="Picture 21"/>
             <wp:cNvGraphicFramePr>
               <a:graphicFrameLocks noChangeAspect="1"/>
@@ -5444,7 +5444,7 @@
                   <pic:spPr>
                     <a:xfrm>
                       <a:off x="0" y="0"/>
-                      <a:ext cx="5669280" cy="2156791"/>
+                      <a:ext cx="5852160" cy="1720215"/>
                     </a:xfrm>
                     <a:prstGeom prst="rect"/>
                   </pic:spPr>
@@ -5668,7 +5668,7 @@
       <w:r>
         <w:drawing>
           <wp:inline xmlns:a="http://schemas.openxmlformats.org/drawingml/2006/main" xmlns:pic="http://schemas.openxmlformats.org/drawingml/2006/picture">
-            <wp:extent cx="5669280" cy="2156791"/>
+            <wp:extent cx="5852160" cy="1720215"/>
             <wp:docPr id="22" name="Picture 22"/>
             <wp:cNvGraphicFramePr>
               <a:graphicFrameLocks noChangeAspect="1"/>
@@ -5689,7 +5689,7 @@
                   <pic:spPr>
                     <a:xfrm>
                       <a:off x="0" y="0"/>
-                      <a:ext cx="5669280" cy="2156791"/>
+                      <a:ext cx="5852160" cy="1720215"/>
                     </a:xfrm>
                     <a:prstGeom prst="rect"/>
                   </pic:spPr>
@@ -5935,7 +5935,7 @@
       <w:r>
         <w:drawing>
           <wp:inline xmlns:a="http://schemas.openxmlformats.org/drawingml/2006/main" xmlns:pic="http://schemas.openxmlformats.org/drawingml/2006/picture">
-            <wp:extent cx="5669280" cy="2464904"/>
+            <wp:extent cx="5852160" cy="1937385"/>
             <wp:docPr id="23" name="Picture 23"/>
             <wp:cNvGraphicFramePr>
               <a:graphicFrameLocks noChangeAspect="1"/>
@@ -5956,7 +5956,7 @@
                   <pic:spPr>
                     <a:xfrm>
                       <a:off x="0" y="0"/>
-                      <a:ext cx="5669280" cy="2464904"/>
+                      <a:ext cx="5852160" cy="1937385"/>
                     </a:xfrm>
                     <a:prstGeom prst="rect"/>
                   </pic:spPr>
@@ -6217,7 +6217,7 @@
       <w:r>
         <w:drawing>
           <wp:inline xmlns:a="http://schemas.openxmlformats.org/drawingml/2006/main" xmlns:pic="http://schemas.openxmlformats.org/drawingml/2006/picture">
-            <wp:extent cx="5669280" cy="2310848"/>
+            <wp:extent cx="5852160" cy="1828800"/>
             <wp:docPr id="24" name="Picture 24"/>
             <wp:cNvGraphicFramePr>
               <a:graphicFrameLocks noChangeAspect="1"/>
@@ -6238,7 +6238,7 @@
                   <pic:spPr>
                     <a:xfrm>
                       <a:off x="0" y="0"/>
-                      <a:ext cx="5669280" cy="2310848"/>
+                      <a:ext cx="5852160" cy="1828800"/>
                     </a:xfrm>
                     <a:prstGeom prst="rect"/>
                   </pic:spPr>
@@ -6467,7 +6467,7 @@
       <w:r>
         <w:drawing>
           <wp:inline xmlns:a="http://schemas.openxmlformats.org/drawingml/2006/main" xmlns:pic="http://schemas.openxmlformats.org/drawingml/2006/picture">
-            <wp:extent cx="5669280" cy="2310848"/>
+            <wp:extent cx="5852160" cy="1828800"/>
             <wp:docPr id="25" name="Picture 25"/>
             <wp:cNvGraphicFramePr>
               <a:graphicFrameLocks noChangeAspect="1"/>
@@ -6488,7 +6488,7 @@
                   <pic:spPr>
                     <a:xfrm>
                       <a:off x="0" y="0"/>
-                      <a:ext cx="5669280" cy="2310848"/>
+                      <a:ext cx="5852160" cy="1828800"/>
                     </a:xfrm>
                     <a:prstGeom prst="rect"/>
                   </pic:spPr>
@@ -6704,7 +6704,7 @@
       <w:r>
         <w:drawing>
           <wp:inline xmlns:a="http://schemas.openxmlformats.org/drawingml/2006/main" xmlns:pic="http://schemas.openxmlformats.org/drawingml/2006/picture">
-            <wp:extent cx="5669280" cy="1694622"/>
+            <wp:extent cx="5852160" cy="1394460"/>
             <wp:docPr id="26" name="Picture 26"/>
             <wp:cNvGraphicFramePr>
               <a:graphicFrameLocks noChangeAspect="1"/>
@@ -6725,7 +6725,7 @@
                   <pic:spPr>
                     <a:xfrm>
                       <a:off x="0" y="0"/>
-                      <a:ext cx="5669280" cy="1694622"/>
+                      <a:ext cx="5852160" cy="1394460"/>
                     </a:xfrm>
                     <a:prstGeom prst="rect"/>
                   </pic:spPr>
@@ -6972,7 +6972,7 @@
       <w:r>
         <w:drawing>
           <wp:inline xmlns:a="http://schemas.openxmlformats.org/drawingml/2006/main" xmlns:pic="http://schemas.openxmlformats.org/drawingml/2006/picture">
-            <wp:extent cx="5669280" cy="2927074"/>
+            <wp:extent cx="5852160" cy="2263140"/>
             <wp:docPr id="27" name="Picture 27"/>
             <wp:cNvGraphicFramePr>
               <a:graphicFrameLocks noChangeAspect="1"/>
@@ -6993,7 +6993,7 @@
                   <pic:spPr>
                     <a:xfrm>
                       <a:off x="0" y="0"/>
-                      <a:ext cx="5669280" cy="2927074"/>
+                      <a:ext cx="5852160" cy="2263140"/>
                     </a:xfrm>
                     <a:prstGeom prst="rect"/>
                   </pic:spPr>
@@ -7227,7 +7227,7 @@
       <w:r>
         <w:drawing>
           <wp:inline xmlns:a="http://schemas.openxmlformats.org/drawingml/2006/main" xmlns:pic="http://schemas.openxmlformats.org/drawingml/2006/picture">
-            <wp:extent cx="5669280" cy="2464904"/>
+            <wp:extent cx="5852160" cy="1937385"/>
             <wp:docPr id="28" name="Picture 28"/>
             <wp:cNvGraphicFramePr>
               <a:graphicFrameLocks noChangeAspect="1"/>
@@ -7248,7 +7248,7 @@
                   <pic:spPr>
                     <a:xfrm>
                       <a:off x="0" y="0"/>
-                      <a:ext cx="5669280" cy="2464904"/>
+                      <a:ext cx="5852160" cy="1937385"/>
                     </a:xfrm>
                     <a:prstGeom prst="rect"/>
                   </pic:spPr>
@@ -7486,7 +7486,7 @@
       <w:r>
         <w:drawing>
           <wp:inline xmlns:a="http://schemas.openxmlformats.org/drawingml/2006/main" xmlns:pic="http://schemas.openxmlformats.org/drawingml/2006/picture">
-            <wp:extent cx="5669280" cy="2927074"/>
+            <wp:extent cx="5852160" cy="2263140"/>
             <wp:docPr id="29" name="Picture 29"/>
             <wp:cNvGraphicFramePr>
               <a:graphicFrameLocks noChangeAspect="1"/>
@@ -7507,7 +7507,7 @@
                   <pic:spPr>
                     <a:xfrm>
                       <a:off x="0" y="0"/>
-                      <a:ext cx="5669280" cy="2927074"/>
+                      <a:ext cx="5852160" cy="2263140"/>
                     </a:xfrm>
                     <a:prstGeom prst="rect"/>
                   </pic:spPr>
@@ -7775,7 +7775,7 @@
       <w:r>
         <w:drawing>
           <wp:inline xmlns:a="http://schemas.openxmlformats.org/drawingml/2006/main" xmlns:pic="http://schemas.openxmlformats.org/drawingml/2006/picture">
-            <wp:extent cx="5669280" cy="2310848"/>
+            <wp:extent cx="5852160" cy="1828800"/>
             <wp:docPr id="30" name="Picture 30"/>
             <wp:cNvGraphicFramePr>
               <a:graphicFrameLocks noChangeAspect="1"/>
@@ -7796,7 +7796,7 @@
                   <pic:spPr>
                     <a:xfrm>
                       <a:off x="0" y="0"/>
-                      <a:ext cx="5669280" cy="2310848"/>
+                      <a:ext cx="5852160" cy="1828800"/>
                     </a:xfrm>
                     <a:prstGeom prst="rect"/>
                   </pic:spPr>

</xml_diff>